<commit_message>
Update 1_Template Perencanaan Project UKK RPL Risqi XII.docx
</commit_message>
<xml_diff>
--- a/1_Template Perencanaan Project UKK RPL Risqi XII.docx
+++ b/1_Template Perencanaan Project UKK RPL Risqi XII.docx
@@ -12993,7 +12993,7 @@
                 <w:color w:val="000000"/>
               </w:rPr>
               <w:drawing>
-                <wp:inline distT="0" distB="0" distL="0" distR="0" wp14:anchorId="43D4995B" wp14:editId="6BAF1626">
+                <wp:inline distT="0" distB="0" distL="0" distR="0" wp14:anchorId="43D4995B" wp14:editId="3A5729A6">
                   <wp:extent cx="5605780" cy="3369310"/>
                   <wp:effectExtent l="0" t="0" r="0" b="2540"/>
                   <wp:docPr id="1235930200" name="Picture 1"/>
@@ -17037,7 +17037,21 @@
         <w:rPr>
           <w:color w:val="000000"/>
         </w:rPr>
-        <w:t>[Isi Nama Tabel]</w:t>
+        <w:t>[</w:t>
+      </w:r>
+      <w:proofErr w:type="spellStart"/>
+      <w:r>
+        <w:rPr>
+          <w:color w:val="000000"/>
+        </w:rPr>
+        <w:t>Penjualan_toko</w:t>
+      </w:r>
+      <w:proofErr w:type="spellEnd"/>
+      <w:r>
+        <w:rPr>
+          <w:color w:val="000000"/>
+        </w:rPr>
+        <w:t>]</w:t>
       </w:r>
     </w:p>
     <w:tbl>

</xml_diff>